<commit_message>
fix: use institutional branding in reinforcement annexes
</commit_message>
<xml_diff>
--- a/apps/api/assets/reinforcement-annexes/annex-1.docx
+++ b/apps/api/assets/reinforcement-annexes/annex-1.docx
@@ -608,7 +608,7 @@
                 <w:lang w:val="es-EC"/>
               </w:rPr>
               <w:br/>
-              <w:t>Escuela de Educación Básica “Panamá”</w:t>
+              <w:t xml:space="preserve">{{institution_name}}</w:t>
             </w:r>
           </w:p>
         </w:tc>
@@ -1178,7 +1178,7 @@
         <w:sz w:val="28"/>
         <w:szCs w:val="28"/>
       </w:rPr>
-      <w:t>ESCUELA DE EDUCACIÓN básica “PANAMÁ”</w:t>
+      <w:t xml:space="preserve">{{header_institution}}</w:t>
     </w:r>
     <w:r>
       <w:rPr>
@@ -1206,7 +1206,7 @@
         <w:sz w:val="24"/>
         <w:szCs w:val="24"/>
       </w:rPr>
-      <w:t>SUBDIRECCIÓN DE LA ESCUELA PANAMÁ</w:t>
+      <w:t xml:space="preserve">{{header_department}}</w:t>
     </w:r>
     <w:r>
       <w:rPr>
@@ -1222,7 +1222,7 @@
         <w:noProof/>
         <w:lang w:val="es-EC" w:eastAsia="es-EC"/>
       </w:rPr>
-      <w:t>202</w:t>
+      <w:t xml:space="preserve">{{header_academic_year}}</w:t>
     </w:r>
     <w:r>
       <w:rPr>
@@ -1230,7 +1230,7 @@
         <w:noProof/>
         <w:lang w:val="es-EC" w:eastAsia="es-EC"/>
       </w:rPr>
-      <w:t>6-</w:t>
+      <w:t xml:space="preserve">{{header_academic_year__part1}}</w:t>
     </w:r>
     <w:r>
       <w:rPr>
@@ -1238,7 +1238,7 @@
         <w:noProof/>
         <w:lang w:val="es-EC" w:eastAsia="es-EC"/>
       </w:rPr>
-      <w:t>202</w:t>
+      <w:t xml:space="preserve">{{header_academic_year__part2}}</w:t>
     </w:r>
     <w:r>
       <w:rPr>
@@ -1246,7 +1246,7 @@
         <w:noProof/>
         <w:lang w:val="es-EC" w:eastAsia="es-EC"/>
       </w:rPr>
-      <w:t>7</w:t>
+      <w:t xml:space="preserve">{{header_academic_year__part3}}</w:t>
     </w:r>
   </w:p>
 </w:hdr>

</xml_diff>